<commit_message>
bdbi ica update data source
</commit_message>
<xml_diff>
--- a/BDBI/ica_build/result_sync/F5743005_Cui.Jiangkun_BDBI_ICA_Report.docx
+++ b/BDBI/ica_build/result_sync/F5743005_Cui.Jiangkun_BDBI_ICA_Report.docx
@@ -178,7 +178,7 @@
         <w:spacing w:after="120" w:line="276" w:lineRule="auto"/>
       </w:pPr>
       <w:r>
-        <w:t>This report presents a Business Intelligence (BI) solution built in Microsoft Power BI for a global retail business, "Global Superstore", using a four-year transactional dataset of 13,297 order lines spanning 2011–2014, 135 countries and seven regional markets. The objective is to turn raw order data into an interactive dashboard that helps commercial and category managers understand where the business makes and loses money, and to recommend concrete actions to protect margin.</w:t>
+        <w:t>This report presents a Business Intelligence (BI) solution built in Microsoft Power BI for a global retail business, "Global Superstore", using a four-year transactional dataset of 51,290 order lines spanning 2011–2014, 147 countries and seven regional markets. The objective is to turn raw order data into an interactive dashboard that helps commercial and category managers understand where the business makes and loses money, and to recommend concrete actions to protect margin.</w:t>
       </w:r>
     </w:p>
     <w:p>
@@ -186,7 +186,7 @@
         <w:spacing w:after="120" w:line="276" w:lineRule="auto"/>
       </w:pPr>
       <w:r>
-        <w:t>The headline finding is that the business is growing but its profitability is being eroded by discounting. Total sales reached $3.25M at a 12.3% net profit margin ($399K profit), and annual sales grew 74% over the period. However, the analysis shows a clear profit "cliff": order lines with no discount generated $473K of profit, but every discount band above 20% is loss-making, together destroying more than $200K of profit. Two structural problems compound this — the Furniture category (and the Tables sub-category in particular, at −$11K) is unprofitable, and the EMEA and LATAM markets carry the weakest margins (6–9%).</w:t>
+        <w:t>The headline finding is that the business is growing but its profitability is being eroded by discounting. Total sales reached $12.64M at an 11.6% net profit margin ($1.47M profit), and annual sales grew 90% over the period. However, the analysis shows a clear profit "cliff": order lines with no discount generated $1.77M of profit, but every discount band above 20% is loss-making, together destroying more than $800K of profit. Two structural problems compound this — the Furniture category (and the Tables sub-category in particular, at −$64K) is unprofitable, and the EMEA and LATAM markets carry the weakest margins (5–10%).</w:t>
       </w:r>
     </w:p>
     <w:p>
@@ -194,7 +194,7 @@
         <w:spacing w:after="120" w:line="276" w:lineRule="auto"/>
       </w:pPr>
       <w:r>
-        <w:t>The recommendations are therefore to (1) cap standard discounts at 20% and require approval above it, (2) review or re-price the loss-making Tables and Bookcases lines, and (3) apply APAC/EU pricing discipline to the low-margin EMEA and LATAM markets. Two charts summarising the core insight are shown below.</w:t>
+        <w:t>The recommendations are therefore to (1) cap standard discounts at 20% and require approval above it, (2) review or re-price the loss-making Tables lines, and (3) apply APAC/EU pricing discipline to the low-margin EMEA and LATAM markets. Two charts summarising the core insight are shown below.</w:t>
       </w:r>
     </w:p>
     <w:p>
@@ -368,7 +368,7 @@
         <w:spacing w:after="120" w:line="276" w:lineRule="auto"/>
       </w:pPr>
       <w:r>
-        <w:t>It is a single flat table of 13,297 rows and 23 columns, where each row is one product line on a customer order. The columns used in the model are described below.</w:t>
+        <w:t>It is a single flat table of 51,290 rows and 24 columns, where each row is one product line on a customer order. The columns used in the model are described below.</w:t>
       </w:r>
     </w:p>
     <w:tbl>
@@ -893,7 +893,7 @@
                 <w:sz w:val="18"/>
                 <w:szCs w:val="18"/>
               </w:rPr>
-              <w:t>Geography of the sale (7 markets, 13 regions, 135 countries)</w:t>
+              <w:t>Geography of the sale (7 markets, 13 regions, 147 countries)</w:t>
             </w:r>
           </w:p>
         </w:tc>
@@ -1653,7 +1653,7 @@
         <w:spacing w:after="120" w:line="276" w:lineRule="auto"/>
       </w:pPr>
       <w:r>
-        <w:t>Card visuals are used because a single, large number is the clearest way to communicate a KPI to a busy executive. Together the cards show total sales of $3.25M, total profit of $399K, a 12.3% margin, 6,717 orders from 1,434 customers, and a $483 average order value. Finding: the business is sizeable and profitable overall, but the modest 12.3% margin is the number the rest of the analysis sets out to explain.</w:t>
+        <w:t>Card visuals are used because a single, large number is the clearest way to communicate a KPI to a busy executive. Together the cards show total sales of $12.64M, total profit of $1.47M, an 11.6% margin, 25,035 orders from 1,590 customers, and a $505 average order value. Finding: the business is sizeable and profitable overall, but the modest 11.6% margin is the number the rest of the analysis sets out to explain.</w:t>
       </w:r>
     </w:p>
     <w:p>
@@ -1735,7 +1735,7 @@
         <w:spacing w:after="120" w:line="276" w:lineRule="auto"/>
       </w:pPr>
       <w:r>
-        <w:t>A clustered bar chart is used to compare two measures (sales and profit) across the seven markets on one axis. Finding: APAC and EU are the largest and healthiest markets (13–14% margin), while EMEA and LATAM sell reasonably but convert poorly to profit (6.2% and 8.8% margins). Canada is tiny but the most efficient market at a 25% margin — a template for what disciplined pricing achieves.</w:t>
+        <w:t>A clustered bar chart is used to compare two measures (sales and profit) across the seven markets on one axis. Finding: APAC and EU are the largest and healthiest markets (around 12–13% margin), while EMEA and LATAM sell reasonably but convert poorly to profit (5.5% and 10.2% margins). Canada is tiny but the most efficient market at a 27% margin — a template for what disciplined pricing achieves.</w:t>
       </w:r>
     </w:p>
     <w:p>
@@ -1818,7 +1818,7 @@
         <w:spacing w:after="120" w:line="276" w:lineRule="auto"/>
       </w:pPr>
       <w:r>
-        <w:t>A combination chart overlays a margin line on sales bars so volume and profitability are read together. Finding: Technology is the best of both worlds (highest sales and a 14.9% margin), whereas Furniture sells almost as much but converts at only 7.8% — it is a volume business that is not paying its way, which the next chart explains.</w:t>
+        <w:t>A combination chart overlays a margin line on sales bars so volume and profitability are read together. Finding: Technology is the best of both worlds (highest sales and a 14.0% margin), whereas Furniture sells almost as much but converts at only 6.9% — it is a volume business that is not paying its way, which the next chart explains.</w:t>
       </w:r>
     </w:p>
     <w:p>
@@ -1900,7 +1900,7 @@
         <w:spacing w:after="120" w:line="276" w:lineRule="auto"/>
       </w:pPr>
       <w:r>
-        <w:t>A diverging bar with red conditional formatting isolates loss-makers instantly. Finding: the Tables sub-category loses $11K (a −5.9% margin) and Supplies barely breaks even, dragging Furniture down, while Copiers, Phones and Bookcases lead on profit. Tables are the single clearest candidate for re-pricing or delisting.</w:t>
+        <w:t>A diverging bar with red conditional formatting isolates loss-makers instantly. Finding: the Tables sub-category loses $64K (a −8.5% margin) — the only loss-making sub-category — dragging Furniture down, while Copiers, Phones and Bookcases lead on profit. Tables are the single clearest candidate for re-pricing or delisting.</w:t>
       </w:r>
     </w:p>
     <w:p>
@@ -1983,7 +1983,7 @@
         <w:spacing w:after="120" w:line="276" w:lineRule="auto"/>
       </w:pPr>
       <w:r>
-        <w:t>This bar chart groups every order line into discount bands (a DAX calculated column) and sums profit per band. Finding: this is the report’s most important result. Lines with 0% discount earn $473K and 1–20% discount still earn $128K, but every band above 20% is loss-making (−$52K, −$94K, −$55K). The correlation between discount and profit is −0.31. There is a clear, actionable ceiling: discounting beyond 20% systematically destroys profit.</w:t>
+        <w:t>This bar chart groups every order line into discount bands (a DAX calculated column) and sums profit per band. Finding: this is the report’s most important result. Lines with 0% discount earn $1.77M and 1–20% discount still earn $511K, but every band above 20% is loss-making (−$187K, −$388K, −$239K). The correlation between discount and profit is −0.32. There is a clear, actionable ceiling: discounting beyond 20% systematically destroys profit.</w:t>
       </w:r>
     </w:p>
     <w:p>
@@ -2065,7 +2065,7 @@
         <w:spacing w:after="120" w:line="276" w:lineRule="auto"/>
       </w:pPr>
       <w:r>
-        <w:t>A donut shows part-to-whole composition across just three segments. Finding: the Consumer segment drives 51% of sales but carries the lowest margin (11.9%), while Home Office is smallest yet most profitable (13.1%) — suggesting margin, not just volume, should guide customer targeting.</w:t>
+        <w:t>A donut shows part-to-whole composition across just three segments. Finding: the Consumer segment drives 51% of sales but carries the lowest margin (11.5%), while Home Office is smallest yet most profitable (12.0%) — suggesting margin, not just volume, should guide customer targeting.</w:t>
       </w:r>
     </w:p>
     <w:p>
@@ -2148,7 +2148,7 @@
         <w:spacing w:after="120" w:line="276" w:lineRule="auto"/>
       </w:pPr>
       <w:r>
-        <w:t>A line chart is the natural choice for a time series; Power BI’s built-in Forecast (Analytics pane) projects the next 10 months with a 95% confidence band, using the continuous Dim_Date[Date] hierarchy (trimmed to Year/Month) rather than a text field, since Forecast requires an unbroken date axis. Finding: sales are strongly seasonal, peaking each Q4, and the underlying trend is firmly upward — annual sales grew from $606K (2011) to $1.05M (2014), +74%. The forecast points to continued growth, so the margin problem is worth fixing because the revenue base is expanding.</w:t>
+        <w:t>A line chart is the natural choice for a time series; Power BI’s built-in Forecast (Analytics pane) projects the next 10 months with a 95% confidence band, using the continuous Dim_Date[Date] hierarchy (trimmed to Year/Month) rather than a text field, since Forecast requires an unbroken date axis. Finding: sales are strongly seasonal, peaking each Q4, and the underlying trend is firmly upward — annual sales grew from $2.26M (2011) to $4.30M (2014), +90%. The forecast points to continued growth, so the margin problem is worth fixing because the revenue base is expanding.</w:t>
       </w:r>
     </w:p>
     <w:p>
@@ -2312,7 +2312,7 @@
         <w:spacing w:after="120" w:line="276" w:lineRule="auto"/>
       </w:pPr>
       <w:r>
-        <w:t>The Decomposition Tree is used because it lets a manager drill into a single KPI (Total Sales) along whichever dimension answers their question next, rather than forcing a fixed hierarchy the way a normal drill-down chart would. Analyze = Total Sales, Explain by = Market, Segment, Sub-Category. Manually drilling Market → APAC shows APAC’s $944K splits into Consumer ($484K), Corporate ($299K) and Home Office ($160K) — Consumer leads every segment, consistent with Finding 6. Using the tree’s AI “+” auto-split (which picks the single next field that best explains the remaining variation) on Total Sales at the top level automatically selects Segment as the highest-value next split — confirming, independently of the manual drill, that customer segment is the dimension that most cleanly separates high- and low-value sales, ahead of geography or product. This satisfies the new-chart-type and AI-visual requirements in one visual.</w:t>
+        <w:t>The Decomposition Tree is used because it lets a manager drill into a single KPI (Total Sales) along whichever dimension answers their question next, rather than forcing a fixed hierarchy the way a normal drill-down chart would. Analyze = Total Sales, Explain by = Market, Segment, Sub-Category. Manually drilling Market → APAC shows APAC’s $3.59M splits into Consumer ($1.82M), Corporate ($1.08M) and Home Office ($0.69M) — Consumer leads every segment, consistent with Finding 6. Using the tree’s AI “+” auto-split (which picks the single next field that best explains the remaining variation) on Total Sales at the top level automatically selects Segment as the highest-value next split — confirming, independently of the manual drill, that customer segment is the dimension that most cleanly separates high- and low-value sales, ahead of geography or product. This satisfies the new-chart-type and AI-visual requirements in one visual.</w:t>
       </w:r>
     </w:p>
     <w:p>
@@ -2394,7 +2394,7 @@
         <w:spacing w:after="120" w:line="276" w:lineRule="auto"/>
       </w:pPr>
       <w:r>
-        <w:t>Key Influencers is used because it answers a different question to every other chart in this report: not “where is profit low” but “statistically, what factors make a loss more likely.” Analyze = Profit Flag, target value = Loss; Explain by = Category, Discount Band, Market, Order Priority. The AI ranks Discount Band 41–60% as the single strongest influencer — an order line in that band is 5.66x more likely to be a Loss than one that is not, and the 61–100% band is 4.73x more likely. This independently confirms, from a completely different statistical method, the same discount ceiling identified in Finding 5 from the raw profit-by-band totals. The visual also surfaces a second, previously hidden driver: a line is more likely to be a Loss when Category is Furniture (38% of Furniture lines are a Loss, vs a 22.77% average across all lines) — reinforcing Finding 4’s Furniture/Tables concern from an independent angle. Seeing the same conclusion emerge from two unrelated techniques (simple aggregation and AI-driven statistical influence) is stronger evidence than either alone.</w:t>
+        <w:t>Key Influencers is used because it answers a different question to every other chart in this report: not “where is profit low” but “statistically, what factors make a loss more likely.” Analyze = Profit Flag, target value = Loss; Explain by = Category, Discount Band, Market, Order Priority. The AI ranks Discount Band 41–60% as the single strongest influencer — an order line in that band is 5.72x more likely to be a Loss than one that is not, and the 61–100% band is 4.73x more likely. This independently confirms, from a completely different statistical method, the same discount ceiling identified in Finding 5 from the raw profit-by-band totals. The visual also surfaces a second, previously hidden driver: a line is more likely to be a Loss when Category is Furniture (31.6% of Furniture lines are a Loss, vs a 24.5% average across all lines) — reinforcing Finding 4’s Furniture/Tables concern from an independent angle. Seeing the same conclusion emerge from two unrelated techniques (simple aggregation and AI-driven statistical influence) is stronger evidence than either alone.</w:t>
       </w:r>
     </w:p>
     <w:p>
@@ -2476,7 +2476,7 @@
         <w:spacing w:after="120" w:line="276" w:lineRule="auto"/>
       </w:pPr>
       <w:r>
-        <w:t>A filled map is used because geography is best read spatially rather than as a long list of 135 country names. Countries are shaded on a light-to-dark gradient driven by Total Sales (configured via conditional formatting on the map’s fill colour, since country-level sales vary too finely for a fixed colour scale). Finding: the United States alone accounts for $621K of sales — about 19% of the global total from a single country — and renders visibly darker than every neighbouring country on the map, including Canada and Mexico, which are barely shaded by comparison. This is a useful counter-weight to Finding 2: while APAC and EU lead at the market (regional) level, no single country in either region approaches the concentration of sales sitting in the US alone, which has implications for how geographically concentrated the business’s revenue risk actually is.</w:t>
+        <w:t>A filled map is used because geography is best read spatially rather than as a long list of 147 country names. Countries are shaded on a light-to-dark gradient driven by Total Sales (configured via conditional formatting on the map’s fill colour, since country-level sales vary too finely for a fixed colour scale). Finding: the United States alone accounts for $2.30M of sales — about 18% of the global total from a single country — and renders visibly darker than every neighbouring country on the map, including Canada and Mexico, which are barely shaded by comparison. This is a useful counter-weight to Finding 2: while APAC and EU lead at the market (regional) level, no single country in either region approaches the concentration of sales sitting in the US alone, which has implications for how geographically concentrated the business’s revenue risk actually is.</w:t>
       </w:r>
     </w:p>
     <w:p>
@@ -2531,7 +2531,7 @@
         <w:t xml:space="preserve">Cap discounts at 20%. </w:t>
       </w:r>
       <w:r>
-        <w:t>Figure 5 shows every band above 20% is loss-making; a hard cap with sign-off above it would recover $200K+ of profit.</w:t>
+        <w:t>Figure 5 shows every band above 20% is loss-making; a hard cap with sign-off above it would recover $800K+ of profit.</w:t>
       </w:r>
     </w:p>
     <w:p>
@@ -2548,7 +2548,7 @@
           <w:b/>
           <w:bCs/>
         </w:rPr>
-        <w:t xml:space="preserve">Fix or drop Tables and Supplies. </w:t>
+        <w:t xml:space="preserve">Fix or drop Tables. </w:t>
       </w:r>
       <w:r>
         <w:t>Figure 4 shows Tables lose money outright; re-price, renegotiate supply cost, or delist.</w:t>
@@ -2679,7 +2679,7 @@
         <w:spacing w:after="60" w:line="270" w:lineRule="auto"/>
       </w:pPr>
       <w:r>
-        <w:t>Promoted the first row to headers and verified the 23 columns import correctly.</w:t>
+        <w:t>Promoted the first row to headers and verified the 24 columns import correctly.</w:t>
       </w:r>
     </w:p>
     <w:p>
@@ -2718,7 +2718,7 @@
         <w:spacing w:after="60" w:line="270" w:lineRule="auto"/>
       </w:pPr>
       <w:r>
-        <w:t>Removed duplicate rows on Row ID so the fact grain is exactly one row per order line (13,297 rows).</w:t>
+        <w:t>Removed duplicate rows on Row ID so the fact grain is exactly one row per order line (51,290 rows).</w:t>
       </w:r>
     </w:p>
     <w:p>
@@ -3071,7 +3071,7 @@
                 <w:sz w:val="18"/>
                 <w:szCs w:val="18"/>
               </w:rPr>
-              <w:t>13,297</w:t>
+              <w:t>51,290</w:t>
             </w:r>
           </w:p>
         </w:tc>
@@ -3263,7 +3263,7 @@
                 <w:sz w:val="18"/>
                 <w:szCs w:val="18"/>
               </w:rPr>
-              <w:t>1,434</w:t>
+              <w:t>1,590</w:t>
             </w:r>
           </w:p>
         </w:tc>
@@ -3359,7 +3359,7 @@
                 <w:sz w:val="18"/>
                 <w:szCs w:val="18"/>
               </w:rPr>
-              <w:t>6,984</w:t>
+              <w:t>10,292</w:t>
             </w:r>
           </w:p>
         </w:tc>
@@ -3455,7 +3455,7 @@
                 <w:sz w:val="18"/>
                 <w:szCs w:val="18"/>
               </w:rPr>
-              <w:t>2,261</w:t>
+              <w:t>3,812</w:t>
             </w:r>
           </w:p>
         </w:tc>
@@ -3562,7 +3562,7 @@
         <w:spacing w:after="120" w:line="276" w:lineRule="auto"/>
       </w:pPr>
       <w:r>
-        <w:t>Dim_Date is built with ADDCOLUMNS(CALENDAR(DATE(2011,1,1), DATE(2014,12,31)), ...), producing one row per calendar day across the full four-year span (1,461 days, including the 2012 leap day) — not just the 1,442 distinct dates that happen to appear in the order data — so that a continuous time axis is available for the Analytics-pane Forecast in Finding 7 (Power BI’s Forecast requires an unbroken date sequence, not just the dates on which a sale happened). Alongside the standard Year / Quarter / Month attributes, Dim_Date also carries a numeric MonthYearSort calculated column, used with Power BI’s “Sort by Column” feature so the text field MonthYear (e.g. “Jan 2011”) sorts chronologically rather than alphabetically wherever it is used.</w:t>
+        <w:t>Dim_Date is built with ADDCOLUMNS(CALENDAR(DATE(2011,1,1), DATE(2014,12,31)), ...), producing one row per calendar day across the full four-year span (1,461 days, including the 2012 leap day) — not just the 1,430 distinct dates that happen to appear in the order data — so that a continuous time axis is available for the Analytics-pane Forecast in Finding 7 (Power BI’s Forecast requires an unbroken date sequence, not just the dates on which a sale happened). Alongside the standard Year / Quarter / Month attributes, Dim_Date also carries a numeric MonthYearSort calculated column, used with Power BI’s “Sort by Column” feature so the text field MonthYear (e.g. “Jan 2011”) sorts chronologically rather than alphabetically wherever it is used.</w:t>
       </w:r>
     </w:p>
     <w:p>

</xml_diff>